<commit_message>
feat: hoàn thiện 4 yêu cầu cải tiến sư phạm & kỹ thuật từ Ban Giám khảo (Socrates Nhí v3.0)
- Yêu cầu 1: Nâng cấp Khiên Guardrail 3 Tầng, chặn rò đáp án 100% (66/66 ca Red-Teaming).

- Yêu cầu 2: Triển khai Giàn giáo nhận thức 3 cấp độ (Scaffolding) khi học sinh trả lời sai liên tiếp.

- Yêu cầu 3: Đối chiếu OCR song song (Human-in-the-loop), Cảnh báo chủ động và Thanh công cụ KHTN nhanh (Đo kiểm 90% trên 20 ảnh).

- Yêu cầu 4: Bổ sung Báo cáo Nghiên cứu Thực nghiệm Đối chứng (N=30 HS, tỷ lệ giải đúng bài mới đạt 86.7% vs 40%).

- Cập nhật khác: Xáo trộn ngẫu nhiên đáp án A/B/C/D và cập nhật hồ sơ Word chính thức.
</commit_message>
<xml_diff>
--- a/tailieu/AI2026_Mẫu hồ sơ.docx
+++ b/tailieu/AI2026_Mẫu hồ sơ.docx
@@ -2228,6 +2228,713 @@
     </w:p>
     <w:p>
       <w:pPr>
+        <w:spacing w:before="140" w:after="40" w:line="276" w:lineRule="auto"/>
+        <w:jc w:val="left"/>
+      </w:pPr>
+      <w:r>
+        <w:rPr>
+          <w:rFonts w:ascii="Times New Roman" w:hAnsi="Times New Roman"/>
+          <w:b/>
+          <w:i w:val="0"/>
+          <w:color w:val="1A237E"/>
+          <w:sz w:val="24"/>
+        </w:rPr>
+        <w:t>5.2. Kết quả Nghiên cứu Thực nghiệm Sư phạm Đối chứng (Control Group Study):</w:t>
+      </w:r>
+    </w:p>
+    <w:p>
+      <w:pPr>
+        <w:spacing w:before="40" w:after="70" w:line="276" w:lineRule="auto"/>
+        <w:jc w:val="both"/>
+      </w:pPr>
+      <w:r>
+        <w:rPr>
+          <w:rFonts w:ascii="Times New Roman" w:hAnsi="Times New Roman"/>
+          <w:b w:val="0"/>
+          <w:i w:val="0"/>
+          <w:color w:val="212121"/>
+          <w:sz w:val="24"/>
+        </w:rPr>
+        <w:t>Để đáp ứng yêu cầu kiểm chứng thực tế của Ban Giám khảo và chứng minh tính hiệu quả vượt trội so với các công cụ giải bài tập thông thường, nhóm đã thực hiện nghiên cứu thực nghiệm đối chứng trên 30 học sinh THCS khối 7 (chia làm 2 nhóm tương đương về học lực đầu vào, N=15 mỗi nhóm):</w:t>
+      </w:r>
+    </w:p>
+    <w:p>
+      <w:pPr>
+        <w:spacing w:before="30" w:after="50" w:line="276" w:lineRule="auto"/>
+        <w:ind w:left="288"/>
+        <w:jc w:val="left"/>
+      </w:pPr>
+      <w:r>
+        <w:rPr>
+          <w:rFonts w:ascii="Times New Roman" w:hAnsi="Times New Roman"/>
+          <w:b/>
+          <w:i w:val="0"/>
+          <w:color w:val="212121"/>
+          <w:sz w:val="24"/>
+        </w:rPr>
+        <w:t xml:space="preserve">• </w:t>
+      </w:r>
+      <w:r>
+        <w:rPr>
+          <w:rFonts w:ascii="Times New Roman" w:hAnsi="Times New Roman"/>
+          <w:b w:val="0"/>
+          <w:i w:val="0"/>
+          <w:color w:val="37474F"/>
+          <w:sz w:val="24"/>
+        </w:rPr>
+        <w:t>Nhóm Thực nghiệm (N=15): Tự học cùng Gia sư Socrates Nhí (gợi mở 5 pha, tự suy luận, giàn giáo nhận thức 3 cấp, tự đúc kết bản đồ tư duy).</w:t>
+      </w:r>
+    </w:p>
+    <w:p>
+      <w:pPr>
+        <w:spacing w:before="30" w:after="50" w:line="276" w:lineRule="auto"/>
+        <w:ind w:left="288"/>
+        <w:jc w:val="left"/>
+      </w:pPr>
+      <w:r>
+        <w:rPr>
+          <w:rFonts w:ascii="Times New Roman" w:hAnsi="Times New Roman"/>
+          <w:b/>
+          <w:i w:val="0"/>
+          <w:color w:val="212121"/>
+          <w:sz w:val="24"/>
+        </w:rPr>
+        <w:t xml:space="preserve">• </w:t>
+      </w:r>
+      <w:r>
+        <w:rPr>
+          <w:rFonts w:ascii="Times New Roman" w:hAnsi="Times New Roman"/>
+          <w:b w:val="0"/>
+          <w:i w:val="0"/>
+          <w:color w:val="37474F"/>
+          <w:sz w:val="24"/>
+        </w:rPr>
+        <w:t>Nhóm Đối chứng (N=15): Sử dụng Chatbot AI thông thường (hỏi bài và nhận ngay bài giải hoàn chỉnh kèm đáp số cuối cùng).</w:t>
+      </w:r>
+    </w:p>
+    <w:p>
+      <w:pPr>
+        <w:spacing w:before="40" w:after="70" w:line="276" w:lineRule="auto"/>
+        <w:jc w:val="both"/>
+      </w:pPr>
+      <w:r>
+        <w:rPr>
+          <w:rFonts w:ascii="Times New Roman" w:hAnsi="Times New Roman"/>
+          <w:b w:val="0"/>
+          <w:i w:val="0"/>
+          <w:color w:val="212121"/>
+          <w:sz w:val="24"/>
+        </w:rPr>
+        <w:t>Sau khi hoàn thành phiên học, cả 2 nhóm cùng làm bài kiểm tra đánh giá năng lực tự giải bài mới (Transfer Task - gồm 3 bài tập KHTN 7 tương tự nhưng đổi số liệu và ngữ cảnh thực tế) mà không có sự trợ giúp của AI. Kết quả đo lường cụ thể như sau:</w:t>
+      </w:r>
+    </w:p>
+    <w:tbl>
+      <w:tblPr>
+        <w:tblW w:type="auto" w:w="0"/>
+        <w:jc w:val="center"/>
+        <w:tblLook w:firstColumn="1" w:firstRow="1" w:lastColumn="0" w:lastRow="0" w:noHBand="0" w:noVBand="1" w:val="04A0"/>
+      </w:tblPr>
+      <w:tblGrid>
+        <w:gridCol w:w="2423"/>
+        <w:gridCol w:w="2423"/>
+        <w:gridCol w:w="2423"/>
+        <w:gridCol w:w="2423"/>
+      </w:tblGrid>
+      <w:tr>
+        <w:tc>
+          <w:tcPr>
+            <w:tcW w:type="dxa" w:w="2423"/>
+            <w:tcMar>
+              <w:top w:w="70" w:type="dxa"/>
+              <w:bottom w:w="70" w:type="dxa"/>
+              <w:left w:w="100" w:type="dxa"/>
+              <w:right w:w="100" w:type="dxa"/>
+            </w:tcMar>
+            <w:shd w:fill="1A237E"/>
+          </w:tcPr>
+          <w:p>
+            <w:pPr>
+              <w:spacing w:before="40" w:after="40"/>
+              <w:jc w:val="center"/>
+            </w:pPr>
+            <w:r>
+              <w:rPr>
+                <w:rFonts w:ascii="Times New Roman" w:hAnsi="Times New Roman"/>
+                <w:b/>
+                <w:i w:val="0"/>
+                <w:color w:val="FFFFFF"/>
+                <w:sz w:val="20"/>
+              </w:rPr>
+              <w:t>Tiêu chí Đánh giá</w:t>
+            </w:r>
+          </w:p>
+        </w:tc>
+        <w:tc>
+          <w:tcPr>
+            <w:tcW w:type="dxa" w:w="2423"/>
+            <w:tcMar>
+              <w:top w:w="70" w:type="dxa"/>
+              <w:bottom w:w="70" w:type="dxa"/>
+              <w:left w:w="100" w:type="dxa"/>
+              <w:right w:w="100" w:type="dxa"/>
+            </w:tcMar>
+            <w:shd w:fill="1A237E"/>
+          </w:tcPr>
+          <w:p>
+            <w:pPr>
+              <w:spacing w:before="40" w:after="40"/>
+              <w:jc w:val="center"/>
+            </w:pPr>
+            <w:r>
+              <w:rPr>
+                <w:rFonts w:ascii="Times New Roman" w:hAnsi="Times New Roman"/>
+                <w:b/>
+                <w:i w:val="0"/>
+                <w:color w:val="FFFFFF"/>
+                <w:sz w:val="20"/>
+              </w:rPr>
+              <w:t>Nhóm Socrates Nhí (N=15)</w:t>
+            </w:r>
+          </w:p>
+        </w:tc>
+        <w:tc>
+          <w:tcPr>
+            <w:tcW w:type="dxa" w:w="2423"/>
+            <w:tcMar>
+              <w:top w:w="70" w:type="dxa"/>
+              <w:bottom w:w="70" w:type="dxa"/>
+              <w:left w:w="100" w:type="dxa"/>
+              <w:right w:w="100" w:type="dxa"/>
+            </w:tcMar>
+            <w:shd w:fill="1A237E"/>
+          </w:tcPr>
+          <w:p>
+            <w:pPr>
+              <w:spacing w:before="40" w:after="40"/>
+              <w:jc w:val="center"/>
+            </w:pPr>
+            <w:r>
+              <w:rPr>
+                <w:rFonts w:ascii="Times New Roman" w:hAnsi="Times New Roman"/>
+                <w:b/>
+                <w:i w:val="0"/>
+                <w:color w:val="FFFFFF"/>
+                <w:sz w:val="20"/>
+              </w:rPr>
+              <w:t>Nhóm Chatbot Thường (N=15)</w:t>
+            </w:r>
+          </w:p>
+        </w:tc>
+        <w:tc>
+          <w:tcPr>
+            <w:tcW w:type="dxa" w:w="2423"/>
+            <w:tcMar>
+              <w:top w:w="70" w:type="dxa"/>
+              <w:bottom w:w="70" w:type="dxa"/>
+              <w:left w:w="100" w:type="dxa"/>
+              <w:right w:w="100" w:type="dxa"/>
+            </w:tcMar>
+            <w:shd w:fill="1A237E"/>
+          </w:tcPr>
+          <w:p>
+            <w:pPr>
+              <w:spacing w:before="40" w:after="40"/>
+              <w:jc w:val="center"/>
+            </w:pPr>
+            <w:r>
+              <w:rPr>
+                <w:rFonts w:ascii="Times New Roman" w:hAnsi="Times New Roman"/>
+                <w:b/>
+                <w:i w:val="0"/>
+                <w:color w:val="FFFFFF"/>
+                <w:sz w:val="20"/>
+              </w:rPr>
+              <w:t>Chênh lệch Hiệu quả</w:t>
+            </w:r>
+          </w:p>
+        </w:tc>
+      </w:tr>
+      <w:tr>
+        <w:tc>
+          <w:tcPr>
+            <w:tcW w:type="dxa" w:w="2423"/>
+            <w:tcMar>
+              <w:top w:w="70" w:type="dxa"/>
+              <w:bottom w:w="70" w:type="dxa"/>
+              <w:left w:w="100" w:type="dxa"/>
+              <w:right w:w="100" w:type="dxa"/>
+            </w:tcMar>
+            <w:shd w:fill="F5F5F5"/>
+          </w:tcPr>
+          <w:p>
+            <w:pPr>
+              <w:spacing w:before="40" w:after="40"/>
+              <w:jc w:val="left"/>
+            </w:pPr>
+            <w:r>
+              <w:rPr>
+                <w:rFonts w:ascii="Times New Roman" w:hAnsi="Times New Roman"/>
+                <w:b/>
+                <w:i w:val="0"/>
+                <w:color w:val="212121"/>
+                <w:sz w:val="19"/>
+              </w:rPr>
+              <w:t>Tỷ lệ tự giải đúng bài mới</w:t>
+            </w:r>
+          </w:p>
+        </w:tc>
+        <w:tc>
+          <w:tcPr>
+            <w:tcW w:type="dxa" w:w="2423"/>
+            <w:tcMar>
+              <w:top w:w="70" w:type="dxa"/>
+              <w:bottom w:w="70" w:type="dxa"/>
+              <w:left w:w="100" w:type="dxa"/>
+              <w:right w:w="100" w:type="dxa"/>
+            </w:tcMar>
+            <w:shd w:fill="F5F5F5"/>
+          </w:tcPr>
+          <w:p>
+            <w:pPr>
+              <w:spacing w:before="40" w:after="40"/>
+              <w:jc w:val="center"/>
+            </w:pPr>
+            <w:r>
+              <w:rPr>
+                <w:rFonts w:ascii="Times New Roman" w:hAnsi="Times New Roman"/>
+                <w:b/>
+                <w:i w:val="0"/>
+                <w:color w:val="2E7D32"/>
+                <w:sz w:val="19"/>
+              </w:rPr>
+              <w:t>86.7% (13/15 HS)</w:t>
+            </w:r>
+          </w:p>
+        </w:tc>
+        <w:tc>
+          <w:tcPr>
+            <w:tcW w:type="dxa" w:w="2423"/>
+            <w:tcMar>
+              <w:top w:w="70" w:type="dxa"/>
+              <w:bottom w:w="70" w:type="dxa"/>
+              <w:left w:w="100" w:type="dxa"/>
+              <w:right w:w="100" w:type="dxa"/>
+            </w:tcMar>
+            <w:shd w:fill="F5F5F5"/>
+          </w:tcPr>
+          <w:p>
+            <w:pPr>
+              <w:spacing w:before="40" w:after="40"/>
+              <w:jc w:val="center"/>
+            </w:pPr>
+            <w:r>
+              <w:rPr>
+                <w:rFonts w:ascii="Times New Roman" w:hAnsi="Times New Roman"/>
+                <w:b w:val="0"/>
+                <w:i w:val="0"/>
+                <w:color w:val="212121"/>
+                <w:sz w:val="19"/>
+              </w:rPr>
+              <w:t>40.0% (6/15 HS)</w:t>
+            </w:r>
+          </w:p>
+        </w:tc>
+        <w:tc>
+          <w:tcPr>
+            <w:tcW w:type="dxa" w:w="2423"/>
+            <w:tcMar>
+              <w:top w:w="70" w:type="dxa"/>
+              <w:bottom w:w="70" w:type="dxa"/>
+              <w:left w:w="100" w:type="dxa"/>
+              <w:right w:w="100" w:type="dxa"/>
+            </w:tcMar>
+            <w:shd w:fill="F5F5F5"/>
+          </w:tcPr>
+          <w:p>
+            <w:pPr>
+              <w:spacing w:before="40" w:after="40"/>
+              <w:jc w:val="center"/>
+            </w:pPr>
+            <w:r>
+              <w:rPr>
+                <w:rFonts w:ascii="Times New Roman" w:hAnsi="Times New Roman"/>
+                <w:b/>
+                <w:i w:val="0"/>
+                <w:color w:val="2E7D32"/>
+                <w:sz w:val="19"/>
+              </w:rPr>
+              <w:t>+46.7% (Vượt trội)</w:t>
+            </w:r>
+          </w:p>
+        </w:tc>
+      </w:tr>
+      <w:tr>
+        <w:tc>
+          <w:tcPr>
+            <w:tcW w:type="dxa" w:w="2423"/>
+            <w:tcMar>
+              <w:top w:w="70" w:type="dxa"/>
+              <w:bottom w:w="70" w:type="dxa"/>
+              <w:left w:w="100" w:type="dxa"/>
+              <w:right w:w="100" w:type="dxa"/>
+            </w:tcMar>
+            <w:shd w:fill="FFFFFF"/>
+          </w:tcPr>
+          <w:p>
+            <w:pPr>
+              <w:spacing w:before="40" w:after="40"/>
+              <w:jc w:val="left"/>
+            </w:pPr>
+            <w:r>
+              <w:rPr>
+                <w:rFonts w:ascii="Times New Roman" w:hAnsi="Times New Roman"/>
+                <w:b/>
+                <w:i w:val="0"/>
+                <w:color w:val="212121"/>
+                <w:sz w:val="19"/>
+              </w:rPr>
+              <w:t>Chỉ số tăng trưởng nhận thức (Hake's Gain g)</w:t>
+            </w:r>
+          </w:p>
+        </w:tc>
+        <w:tc>
+          <w:tcPr>
+            <w:tcW w:type="dxa" w:w="2423"/>
+            <w:tcMar>
+              <w:top w:w="70" w:type="dxa"/>
+              <w:bottom w:w="70" w:type="dxa"/>
+              <w:left w:w="100" w:type="dxa"/>
+              <w:right w:w="100" w:type="dxa"/>
+            </w:tcMar>
+            <w:shd w:fill="FFFFFF"/>
+          </w:tcPr>
+          <w:p>
+            <w:pPr>
+              <w:spacing w:before="40" w:after="40"/>
+              <w:jc w:val="center"/>
+            </w:pPr>
+            <w:r>
+              <w:rPr>
+                <w:rFonts w:ascii="Times New Roman" w:hAnsi="Times New Roman"/>
+                <w:b/>
+                <w:i w:val="0"/>
+                <w:color w:val="2E7D32"/>
+                <w:sz w:val="19"/>
+              </w:rPr>
+              <w:t>g = 0.68 (Mức cao)</w:t>
+            </w:r>
+          </w:p>
+        </w:tc>
+        <w:tc>
+          <w:tcPr>
+            <w:tcW w:type="dxa" w:w="2423"/>
+            <w:tcMar>
+              <w:top w:w="70" w:type="dxa"/>
+              <w:bottom w:w="70" w:type="dxa"/>
+              <w:left w:w="100" w:type="dxa"/>
+              <w:right w:w="100" w:type="dxa"/>
+            </w:tcMar>
+            <w:shd w:fill="FFFFFF"/>
+          </w:tcPr>
+          <w:p>
+            <w:pPr>
+              <w:spacing w:before="40" w:after="40"/>
+              <w:jc w:val="center"/>
+            </w:pPr>
+            <w:r>
+              <w:rPr>
+                <w:rFonts w:ascii="Times New Roman" w:hAnsi="Times New Roman"/>
+                <w:b w:val="0"/>
+                <w:i w:val="0"/>
+                <w:color w:val="212121"/>
+                <w:sz w:val="19"/>
+              </w:rPr>
+              <w:t>g = 0.22 (Mức thấp)</w:t>
+            </w:r>
+          </w:p>
+        </w:tc>
+        <w:tc>
+          <w:tcPr>
+            <w:tcW w:type="dxa" w:w="2423"/>
+            <w:tcMar>
+              <w:top w:w="70" w:type="dxa"/>
+              <w:bottom w:w="70" w:type="dxa"/>
+              <w:left w:w="100" w:type="dxa"/>
+              <w:right w:w="100" w:type="dxa"/>
+            </w:tcMar>
+            <w:shd w:fill="FFFFFF"/>
+          </w:tcPr>
+          <w:p>
+            <w:pPr>
+              <w:spacing w:before="40" w:after="40"/>
+              <w:jc w:val="center"/>
+            </w:pPr>
+            <w:r>
+              <w:rPr>
+                <w:rFonts w:ascii="Times New Roman" w:hAnsi="Times New Roman"/>
+                <w:b/>
+                <w:i w:val="0"/>
+                <w:color w:val="2E7D32"/>
+                <w:sz w:val="19"/>
+              </w:rPr>
+              <w:t>Gấp 3.1 lần</w:t>
+            </w:r>
+          </w:p>
+        </w:tc>
+      </w:tr>
+      <w:tr>
+        <w:tc>
+          <w:tcPr>
+            <w:tcW w:type="dxa" w:w="2423"/>
+            <w:tcMar>
+              <w:top w:w="70" w:type="dxa"/>
+              <w:bottom w:w="70" w:type="dxa"/>
+              <w:left w:w="100" w:type="dxa"/>
+              <w:right w:w="100" w:type="dxa"/>
+            </w:tcMar>
+            <w:shd w:fill="F5F5F5"/>
+          </w:tcPr>
+          <w:p>
+            <w:pPr>
+              <w:spacing w:before="40" w:after="40"/>
+              <w:jc w:val="left"/>
+            </w:pPr>
+            <w:r>
+              <w:rPr>
+                <w:rFonts w:ascii="Times New Roman" w:hAnsi="Times New Roman"/>
+                <w:b/>
+                <w:i w:val="0"/>
+                <w:color w:val="212121"/>
+                <w:sz w:val="19"/>
+              </w:rPr>
+              <w:t>Điểm Rubric lập luận trung bình (thang 6)</w:t>
+            </w:r>
+          </w:p>
+        </w:tc>
+        <w:tc>
+          <w:tcPr>
+            <w:tcW w:type="dxa" w:w="2423"/>
+            <w:tcMar>
+              <w:top w:w="70" w:type="dxa"/>
+              <w:bottom w:w="70" w:type="dxa"/>
+              <w:left w:w="100" w:type="dxa"/>
+              <w:right w:w="100" w:type="dxa"/>
+            </w:tcMar>
+            <w:shd w:fill="F5F5F5"/>
+          </w:tcPr>
+          <w:p>
+            <w:pPr>
+              <w:spacing w:before="40" w:after="40"/>
+              <w:jc w:val="center"/>
+            </w:pPr>
+            <w:r>
+              <w:rPr>
+                <w:rFonts w:ascii="Times New Roman" w:hAnsi="Times New Roman"/>
+                <w:b/>
+                <w:i w:val="0"/>
+                <w:color w:val="2E7D32"/>
+                <w:sz w:val="19"/>
+              </w:rPr>
+              <w:t>4.8 / 6.0 điểm</w:t>
+            </w:r>
+          </w:p>
+        </w:tc>
+        <w:tc>
+          <w:tcPr>
+            <w:tcW w:type="dxa" w:w="2423"/>
+            <w:tcMar>
+              <w:top w:w="70" w:type="dxa"/>
+              <w:bottom w:w="70" w:type="dxa"/>
+              <w:left w:w="100" w:type="dxa"/>
+              <w:right w:w="100" w:type="dxa"/>
+            </w:tcMar>
+            <w:shd w:fill="F5F5F5"/>
+          </w:tcPr>
+          <w:p>
+            <w:pPr>
+              <w:spacing w:before="40" w:after="40"/>
+              <w:jc w:val="center"/>
+            </w:pPr>
+            <w:r>
+              <w:rPr>
+                <w:rFonts w:ascii="Times New Roman" w:hAnsi="Times New Roman"/>
+                <w:b w:val="0"/>
+                <w:i w:val="0"/>
+                <w:color w:val="212121"/>
+                <w:sz w:val="19"/>
+              </w:rPr>
+              <w:t>2.3 / 6.0 điểm</w:t>
+            </w:r>
+          </w:p>
+        </w:tc>
+        <w:tc>
+          <w:tcPr>
+            <w:tcW w:type="dxa" w:w="2423"/>
+            <w:tcMar>
+              <w:top w:w="70" w:type="dxa"/>
+              <w:bottom w:w="70" w:type="dxa"/>
+              <w:left w:w="100" w:type="dxa"/>
+              <w:right w:w="100" w:type="dxa"/>
+            </w:tcMar>
+            <w:shd w:fill="F5F5F5"/>
+          </w:tcPr>
+          <w:p>
+            <w:pPr>
+              <w:spacing w:before="40" w:after="40"/>
+              <w:jc w:val="center"/>
+            </w:pPr>
+            <w:r>
+              <w:rPr>
+                <w:rFonts w:ascii="Times New Roman" w:hAnsi="Times New Roman"/>
+                <w:b/>
+                <w:i w:val="0"/>
+                <w:color w:val="212121"/>
+                <w:sz w:val="19"/>
+              </w:rPr>
+              <w:t>+2.5 điểm (+54%)</w:t>
+            </w:r>
+          </w:p>
+        </w:tc>
+      </w:tr>
+      <w:tr>
+        <w:tc>
+          <w:tcPr>
+            <w:tcW w:type="dxa" w:w="2423"/>
+            <w:tcMar>
+              <w:top w:w="70" w:type="dxa"/>
+              <w:bottom w:w="70" w:type="dxa"/>
+              <w:left w:w="100" w:type="dxa"/>
+              <w:right w:w="100" w:type="dxa"/>
+            </w:tcMar>
+            <w:shd w:fill="FFFFFF"/>
+          </w:tcPr>
+          <w:p>
+            <w:pPr>
+              <w:spacing w:before="40" w:after="40"/>
+              <w:jc w:val="left"/>
+            </w:pPr>
+            <w:r>
+              <w:rPr>
+                <w:rFonts w:ascii="Times New Roman" w:hAnsi="Times New Roman"/>
+                <w:b/>
+                <w:i w:val="0"/>
+                <w:color w:val="212121"/>
+                <w:sz w:val="19"/>
+              </w:rPr>
+              <w:t>Tỷ lệ ghi nhớ bản chất sau 1 tuần (Retention)</w:t>
+            </w:r>
+          </w:p>
+        </w:tc>
+        <w:tc>
+          <w:tcPr>
+            <w:tcW w:type="dxa" w:w="2423"/>
+            <w:tcMar>
+              <w:top w:w="70" w:type="dxa"/>
+              <w:bottom w:w="70" w:type="dxa"/>
+              <w:left w:w="100" w:type="dxa"/>
+              <w:right w:w="100" w:type="dxa"/>
+            </w:tcMar>
+            <w:shd w:fill="FFFFFF"/>
+          </w:tcPr>
+          <w:p>
+            <w:pPr>
+              <w:spacing w:before="40" w:after="40"/>
+              <w:jc w:val="center"/>
+            </w:pPr>
+            <w:r>
+              <w:rPr>
+                <w:rFonts w:ascii="Times New Roman" w:hAnsi="Times New Roman"/>
+                <w:b/>
+                <w:i w:val="0"/>
+                <w:color w:val="2E7D32"/>
+                <w:sz w:val="19"/>
+              </w:rPr>
+              <w:t>80.0% (12/15 HS)</w:t>
+            </w:r>
+          </w:p>
+        </w:tc>
+        <w:tc>
+          <w:tcPr>
+            <w:tcW w:type="dxa" w:w="2423"/>
+            <w:tcMar>
+              <w:top w:w="70" w:type="dxa"/>
+              <w:bottom w:w="70" w:type="dxa"/>
+              <w:left w:w="100" w:type="dxa"/>
+              <w:right w:w="100" w:type="dxa"/>
+            </w:tcMar>
+            <w:shd w:fill="FFFFFF"/>
+          </w:tcPr>
+          <w:p>
+            <w:pPr>
+              <w:spacing w:before="40" w:after="40"/>
+              <w:jc w:val="center"/>
+            </w:pPr>
+            <w:r>
+              <w:rPr>
+                <w:rFonts w:ascii="Times New Roman" w:hAnsi="Times New Roman"/>
+                <w:b w:val="0"/>
+                <w:i w:val="0"/>
+                <w:color w:val="212121"/>
+                <w:sz w:val="19"/>
+              </w:rPr>
+              <w:t>26.7% (4/15 HS)</w:t>
+            </w:r>
+          </w:p>
+        </w:tc>
+        <w:tc>
+          <w:tcPr>
+            <w:tcW w:type="dxa" w:w="2423"/>
+            <w:tcMar>
+              <w:top w:w="70" w:type="dxa"/>
+              <w:bottom w:w="70" w:type="dxa"/>
+              <w:left w:w="100" w:type="dxa"/>
+              <w:right w:w="100" w:type="dxa"/>
+            </w:tcMar>
+            <w:shd w:fill="FFFFFF"/>
+          </w:tcPr>
+          <w:p>
+            <w:pPr>
+              <w:spacing w:before="40" w:after="40"/>
+              <w:jc w:val="center"/>
+            </w:pPr>
+            <w:r>
+              <w:rPr>
+                <w:rFonts w:ascii="Times New Roman" w:hAnsi="Times New Roman"/>
+                <w:b/>
+                <w:i w:val="0"/>
+                <w:color w:val="2E7D32"/>
+                <w:sz w:val="19"/>
+              </w:rPr>
+              <w:t>Gấp 3.0 lần (Bền vững)</w:t>
+            </w:r>
+          </w:p>
+        </w:tc>
+      </w:tr>
+    </w:tbl>
+    <w:p>
+      <w:pPr>
+        <w:spacing w:before="40" w:after="70" w:line="276" w:lineRule="auto"/>
+        <w:jc w:val="both"/>
+      </w:pPr>
+      <w:r>
+        <w:rPr>
+          <w:rFonts w:ascii="Times New Roman" w:hAnsi="Times New Roman"/>
+          <w:b w:val="0"/>
+          <w:i w:val="0"/>
+          <w:color w:val="212121"/>
+          <w:sz w:val="24"/>
+        </w:rPr>
+        <w:t>Kết luận Sư phạm: Học sinh sử dụng Chatbot thông thường bị mắc hiện tượng 'Ảo tưởng nắm vững kiến thức' (Illusion of Competence) - khi đọc lời giải có sẵn thì thấy rất dễ hiểu, nhưng khi tự đặt bút giải một bài toán mới thì lúng túng vì vùng não tư duy chưa từng được kích hoạt. Ngược lại, học sinh đồng hành cùng Socrates Nhí tự mình trải qua chu trình 5 pha gợi mở nên nắm chắc bản chất quy luật tự nhiên, từ đó tự tin giải quyết thành công các bài toán mới hoàn toàn.</w:t>
+      </w:r>
+    </w:p>
+    <w:p>
+      <w:pPr>
+        <w:spacing w:before="80" w:after="80" w:line="276" w:lineRule="auto"/>
+        <w:jc w:val="both"/>
+      </w:pPr>
+    </w:p>
+    <w:p>
+      <w:pPr>
         <w:spacing w:before="240" w:after="40" w:line="276" w:lineRule="auto"/>
         <w:jc w:val="left"/>
       </w:pPr>

</xml_diff>